<commit_message>
Jonas's ten decisions acted on: JJ.7 restated (the boundary as a driver's prior over looming), the four argument documents revised, the page for JJ drafted (not sent), handover with the free-energy account of the CZB
Co-Authored-By: Claude Fable 5.1 <noreply@anthropic.com>
</commit_message>
<xml_diff>
--- a/docs/active_inference_program.docx
+++ b/docs/active_inference_program.docx
@@ -2,7 +2,7 @@
 <file path=word/document.xml><?xml version="1.0" encoding="utf-8"?>
 <w:document xmlns:w="http://schemas.openxmlformats.org/wordprocessingml/2006/main" xmlns:m="http://schemas.openxmlformats.org/officeDocument/2006/math" xmlns:r="http://schemas.openxmlformats.org/officeDocument/2006/relationships" xmlns:o="urn:schemas-microsoft-com:office:office" xmlns:v="urn:schemas-microsoft-com:vml" xmlns:w10="urn:schemas-microsoft-com:office:word" xmlns:a="http://schemas.openxmlformats.org/drawingml/2006/main" xmlns:pic="http://schemas.openxmlformats.org/drawingml/2006/picture" xmlns:wp="http://schemas.openxmlformats.org/drawingml/2006/wordprocessingDrawing">
   <w:body>
-    <w:bookmarkStart w:id="66" w:name="X3abff8910cde8ec80a06b5b0a66b4833f5ffc30"/>
+    <w:bookmarkStart w:id="67" w:name="X3abff8910cde8ec80a06b5b0a66b4833f5ffc30"/>
     <w:p>
       <w:pPr>
         <w:pStyle w:val="Heading1"/>
@@ -8705,12 +8705,672 @@
       </w:r>
     </w:p>
     <w:bookmarkEnd w:id="64"/>
-    <w:bookmarkStart w:id="65" w:name="references"/>
+    <w:bookmarkStart w:id="65" w:name="X4d1669876bf8912605f37c8d8b4e367635c1d11"/>
     <w:p>
       <w:pPr>
         <w:pStyle w:val="Heading2"/>
       </w:pPr>
       <w:r>
+        <w:t xml:space="preserve">14 What the cards found, 2026-09-18 to 2026-09-22</w:t>
+      </w:r>
+    </w:p>
+    <w:p>
+      <w:pPr>
+        <w:pStyle w:val="FirstParagraph"/>
+      </w:pPr>
+      <w:r>
+        <w:t xml:space="preserve">Added 2026-09-22 (Jonas’s decision 3). Card numbers below reuse this document’s JJ prefix but are</w:t>
+      </w:r>
+      <w:r>
+        <w:t xml:space="preserve"> </w:t>
+      </w:r>
+      <w:r>
+        <w:t xml:space="preserve">the cards actually run, which do not correspond one to one to the ten cards of §11; the review</w:t>
+      </w:r>
+      <w:r>
+        <w:t xml:space="preserve"> </w:t>
+      </w:r>
+      <w:r>
+        <w:rPr>
+          <w:rStyle w:val="VerbatimChar"/>
+        </w:rPr>
+        <w:t xml:space="preserve">docs/review_2026-09-22.md</w:t>
+      </w:r>
+      <w:r>
+        <w:t xml:space="preserve"> </w:t>
+      </w:r>
+      <w:r>
+        <w:t xml:space="preserve">explains why the first arc’s readings were withdrawn, and</w:t>
+      </w:r>
+      <w:r>
+        <w:t xml:space="preserve"> </w:t>
+      </w:r>
+      <w:r>
+        <w:rPr>
+          <w:rStyle w:val="VerbatimChar"/>
+        </w:rPr>
+        <w:t xml:space="preserve">docs/looming_as_free_energy.md</w:t>
+      </w:r>
+      <w:r>
+        <w:t xml:space="preserve"> </w:t>
+      </w:r>
+      <w:r>
+        <w:t xml:space="preserve">where the line went afterwards. Every score is the post-onset</w:t>
+      </w:r>
+      <w:r>
+        <w:t xml:space="preserve"> </w:t>
+      </w:r>
+      <w:r>
+        <w:t xml:space="preserve">held-out weighted RMSE on the second cut-in study (gated looming rule 0.1027, gap 0.1522, chance</w:t>
+      </w:r>
+      <w:r>
+        <w:t xml:space="preserve"> </w:t>
+      </w:r>
+      <w:r>
+        <w:t xml:space="preserve">0.320) and the pre-onset out-of-sample score (G.1’s gate 0.0319, criterion 0.05).</w:t>
+      </w:r>
+    </w:p>
+    <w:tbl>
+      <w:tblPr>
+        <w:tblStyle w:val="Table"/>
+        <w:tblW w:type="pct" w:w="5000"/>
+        <w:tblLayout w:type="fixed"/>
+        <w:tblLook w:firstRow="1" w:lastRow="0" w:firstColumn="0" w:lastColumn="0" w:noHBand="0" w:noVBand="0" w:val="0020"/>
+      </w:tblPr>
+      <w:tblGrid>
+        <w:gridCol w:w="2640"/>
+        <w:gridCol w:w="2640"/>
+        <w:gridCol w:w="2640"/>
+      </w:tblGrid>
+      <w:tr>
+        <w:trPr>
+          <w:tblHeader w:val="on"/>
+        </w:trPr>
+        <w:tc>
+          <w:tcPr/>
+          <w:p>
+            <w:pPr>
+              <w:pStyle w:val="Compact"/>
+            </w:pPr>
+            <w:r>
+              <w:t xml:space="preserve">card</w:t>
+            </w:r>
+          </w:p>
+        </w:tc>
+        <w:tc>
+          <w:tcPr/>
+          <w:p>
+            <w:pPr>
+              <w:pStyle w:val="Compact"/>
+            </w:pPr>
+            <w:r>
+              <w:t xml:space="preserve">what was asked</w:t>
+            </w:r>
+          </w:p>
+        </w:tc>
+        <w:tc>
+          <w:tcPr/>
+          <w:p>
+            <w:pPr>
+              <w:pStyle w:val="Compact"/>
+            </w:pPr>
+            <w:r>
+              <w:t xml:space="preserve">result</w:t>
+            </w:r>
+          </w:p>
+        </w:tc>
+      </w:tr>
+      <w:tr>
+        <w:tc>
+          <w:tcPr/>
+          <w:p>
+            <w:pPr>
+              <w:pStyle w:val="Compact"/>
+            </w:pPr>
+            <w:r>
+              <w:t xml:space="preserve">JJ.2, JJ.2c, JJ.2d</w:t>
+            </w:r>
+          </w:p>
+        </w:tc>
+        <w:tc>
+          <w:tcPr/>
+          <w:p>
+            <w:pPr>
+              <w:pStyle w:val="Compact"/>
+            </w:pPr>
+            <w:r>
+              <w:t xml:space="preserve">does ΔG order the cut-in cells (the project’s staging; the released flags; the single-Gaussian fan)</w:t>
+            </w:r>
+          </w:p>
+        </w:tc>
+        <w:tc>
+          <w:tcPr/>
+          <w:p>
+            <w:pPr>
+              <w:pStyle w:val="Compact"/>
+            </w:pPr>
+            <w:r>
+              <w:rPr>
+                <w:b/>
+                <w:bCs/>
+              </w:rPr>
+              <w:t xml:space="preserve">DROP</w:t>
+            </w:r>
+            <w:r>
+              <w:t xml:space="preserve"> </w:t>
+            </w:r>
+            <w:r>
+              <w:t xml:space="preserve">three times (0.32, 0.32, 0.32; 0 to 3 of 24 matched-TTC rows)</w:t>
+            </w:r>
+          </w:p>
+        </w:tc>
+      </w:tr>
+      <w:tr>
+        <w:tc>
+          <w:tcPr/>
+          <w:p>
+            <w:pPr>
+              <w:pStyle w:val="Compact"/>
+            </w:pPr>
+            <w:r>
+              <w:t xml:space="preserve">JJ.3</w:t>
+            </w:r>
+          </w:p>
+        </w:tc>
+        <w:tc>
+          <w:tcPr/>
+          <w:p>
+            <w:pPr>
+              <w:pStyle w:val="Compact"/>
+            </w:pPr>
+            <w:r>
+              <w:t xml:space="preserve">the same on the left turn and overtake</w:t>
+            </w:r>
+          </w:p>
+        </w:tc>
+        <w:tc>
+          <w:tcPr/>
+          <w:p>
+            <w:pPr>
+              <w:pStyle w:val="Compact"/>
+            </w:pPr>
+            <w:r>
+              <w:t xml:space="preserve">fails; the overtake numbers quoted in the arc were the secondary fold scheme</w:t>
+            </w:r>
+          </w:p>
+        </w:tc>
+      </w:tr>
+      <w:tr>
+        <w:tc>
+          <w:tcPr/>
+          <w:p>
+            <w:pPr>
+              <w:pStyle w:val="Compact"/>
+            </w:pPr>
+            <w:r>
+              <w:t xml:space="preserve">JJ.4</w:t>
+            </w:r>
+          </w:p>
+        </w:tc>
+        <w:tc>
+          <w:tcPr/>
+          <w:p>
+            <w:pPr>
+              <w:pStyle w:val="Compact"/>
+            </w:pPr>
+            <w:r>
+              <w:t xml:space="preserve">precision as spread</w:t>
+            </w:r>
+          </w:p>
+        </w:tc>
+        <w:tc>
+          <w:tcPr/>
+          <w:p>
+            <w:pPr>
+              <w:pStyle w:val="Compact"/>
+            </w:pPr>
+            <w:r>
+              <w:t xml:space="preserve">direction stands (every driver fold positive); magnitudes confounded (review)</w:t>
+            </w:r>
+          </w:p>
+        </w:tc>
+      </w:tr>
+      <w:tr>
+        <w:tc>
+          <w:tcPr/>
+          <w:p>
+            <w:pPr>
+              <w:pStyle w:val="Compact"/>
+            </w:pPr>
+            <w:r>
+              <w:t xml:space="preserve">RE.1, RE.2, RE.4, RE.4b</w:t>
+            </w:r>
+          </w:p>
+        </w:tc>
+        <w:tc>
+          <w:tcPr/>
+          <w:p>
+            <w:pPr>
+              <w:pStyle w:val="Compact"/>
+            </w:pPr>
+            <w:r>
+              <w:t xml:space="preserve">the released criticality signal, its parameter family, its functionals</w:t>
+            </w:r>
+          </w:p>
+        </w:tc>
+        <w:tc>
+          <w:tcPr/>
+          <w:p>
+            <w:pPr>
+              <w:pStyle w:val="Compact"/>
+            </w:pPr>
+            <w:r>
+              <w:t xml:space="preserve">the</w:t>
+            </w:r>
+            <w:r>
+              <w:t xml:space="preserve"> </w:t>
+            </w:r>
+            <w:r>
+              <w:t xml:space="preserve">“inversion”</w:t>
+            </w:r>
+            <w:r>
+              <w:t xml:space="preserve"> </w:t>
+            </w:r>
+            <w:r>
+              <w:t xml:space="preserve">(ρ −0.861) is a horizon-sum accounting effect; RE.4 invalid as run (ego off the road), RE.4b corrected: not credited</w:t>
+            </w:r>
+          </w:p>
+        </w:tc>
+      </w:tr>
+      <w:tr>
+        <w:tc>
+          <w:tcPr/>
+          <w:p>
+            <w:pPr>
+              <w:pStyle w:val="Compact"/>
+            </w:pPr>
+            <w:r>
+              <w:t xml:space="preserve">S1.1, S1.2, S1.4, S1.5, S1.6</w:t>
+            </w:r>
+          </w:p>
+        </w:tc>
+        <w:tc>
+          <w:tcPr/>
+          <w:p>
+            <w:pPr>
+              <w:pStyle w:val="Compact"/>
+            </w:pPr>
+            <w:r>
+              <w:t xml:space="preserve">strand 1’s comfort margin; its preference; a comfort threshold with a standoff; admissibility</w:t>
+            </w:r>
+          </w:p>
+        </w:tc>
+        <w:tc>
+          <w:tcPr/>
+          <w:p>
+            <w:pPr>
+              <w:pStyle w:val="Compact"/>
+            </w:pPr>
+            <w:r>
+              <w:t xml:space="preserve">none credited; on this study the assumed lead braking is the standoff; admissibility turns ΔG into the comfort price of the mildest admissible deceleration and contains a gate as a tolerance on P(conflict)</w:t>
+            </w:r>
+          </w:p>
+        </w:tc>
+      </w:tr>
+      <w:tr>
+        <w:tc>
+          <w:tcPr/>
+          <w:p>
+            <w:pPr>
+              <w:pStyle w:val="Compact"/>
+            </w:pPr>
+            <w:r>
+              <w:t xml:space="preserve">JJ.5, JJ.5b</w:t>
+            </w:r>
+          </w:p>
+        </w:tc>
+        <w:tc>
+          <w:tcPr/>
+          <w:p>
+            <w:pPr>
+              <w:pStyle w:val="Compact"/>
+            </w:pPr>
+            <w:r>
+              <w:t xml:space="preserve">the released model’s own looming preference (τ⁻¹) as the pragmatic value, and four functionals over the horizon</w:t>
+            </w:r>
+          </w:p>
+        </w:tc>
+        <w:tc>
+          <w:tcPr/>
+          <w:p>
+            <w:pPr>
+              <w:pStyle w:val="Compact"/>
+            </w:pPr>
+            <w:r>
+              <w:t xml:space="preserve">not credited; the horizon sum inverts every rollout quantity; τ⁻¹ is a TTC quantity (0.1679 on this design)</w:t>
+            </w:r>
+          </w:p>
+        </w:tc>
+      </w:tr>
+      <w:tr>
+        <w:tc>
+          <w:tcPr/>
+          <w:p>
+            <w:pPr>
+              <w:pStyle w:val="Compact"/>
+            </w:pPr>
+            <w:r>
+              <w:t xml:space="preserve">JJ.6, JJ.6b, JJ.6c, JJ.6d</w:t>
+            </w:r>
+          </w:p>
+        </w:tc>
+        <w:tc>
+          <w:tcPr/>
+          <w:p>
+            <w:pPr>
+              <w:pStyle w:val="Compact"/>
+            </w:pPr>
+            <w:r>
+              <w:t xml:space="preserve">the intention belief as the gate</w:t>
+            </w:r>
+          </w:p>
+        </w:tc>
+        <w:tc>
+          <w:tcPr/>
+          <w:p>
+            <w:pPr>
+              <w:pStyle w:val="Compact"/>
+            </w:pPr>
+            <w:r>
+              <w:t xml:space="preserve">reproduces G.1’s gate where closed (pre-onset 0.0354, nothing fitted); at no keeping spread does an intention filter reproduce its grading</w:t>
+            </w:r>
+          </w:p>
+        </w:tc>
+      </w:tr>
+      <w:tr>
+        <w:tc>
+          <w:tcPr/>
+          <w:p>
+            <w:pPr>
+              <w:pStyle w:val="Compact"/>
+            </w:pPr>
+            <w:r>
+              <w:rPr>
+                <w:b/>
+                <w:bCs/>
+              </w:rPr>
+              <w:t xml:space="preserve">JJ.6e</w:t>
+            </w:r>
+          </w:p>
+        </w:tc>
+        <w:tc>
+          <w:tcPr/>
+          <w:p>
+            <w:pPr>
+              <w:pStyle w:val="Compact"/>
+            </w:pPr>
+            <w:r>
+              <w:t xml:space="preserve">the gate as predictive lateral uncertainty, no intention variable</w:t>
+            </w:r>
+          </w:p>
+        </w:tc>
+        <w:tc>
+          <w:tcPr/>
+          <w:p>
+            <w:pPr>
+              <w:pStyle w:val="Compact"/>
+            </w:pPr>
+            <w:r>
+              <w:rPr>
+                <w:b/>
+                <w:bCs/>
+              </w:rPr>
+              <w:t xml:space="preserve">DERIVED</w:t>
+            </w:r>
+            <w:r>
+              <w:t xml:space="preserve">: G.1’s gate is Φ((m − l₀ − l̇T)/(σT)) to 1e-16, s_l = σT; with m = 0, 0.1028 / 0.0462; circular through σ (from G.1’s s_l; card JJ.9 measures it on highD)</w:t>
+            </w:r>
+          </w:p>
+        </w:tc>
+      </w:tr>
+      <w:tr>
+        <w:tc>
+          <w:tcPr/>
+          <w:p>
+            <w:pPr>
+              <w:pStyle w:val="Compact"/>
+            </w:pPr>
+            <w:r>
+              <w:t xml:space="preserve">JJ.8</w:t>
+            </w:r>
+          </w:p>
+        </w:tc>
+        <w:tc>
+          <w:tcPr/>
+          <w:p>
+            <w:pPr>
+              <w:pStyle w:val="Compact"/>
+            </w:pPr>
+            <w:r>
+              <w:t xml:space="preserve">the link and the scale of the looming threshold</w:t>
+            </w:r>
+          </w:p>
+        </w:tc>
+        <w:tc>
+          <w:tcPr/>
+          <w:p>
+            <w:pPr>
+              <w:pStyle w:val="Compact"/>
+            </w:pPr>
+            <w:r>
+              <w:t xml:space="preserve">additive noise rejected (+0.023): the spread is a spread of levels; the one-step EFE decision is indistinguishable from the reflex reading but degenerate</w:t>
+            </w:r>
+          </w:p>
+        </w:tc>
+      </w:tr>
+      <w:tr>
+        <w:tc>
+          <w:tcPr/>
+          <w:p>
+            <w:pPr>
+              <w:pStyle w:val="Compact"/>
+            </w:pPr>
+            <w:r>
+              <w:t xml:space="preserve">JJ.10</w:t>
+            </w:r>
+          </w:p>
+        </w:tc>
+        <w:tc>
+          <w:tcPr/>
+          <w:p>
+            <w:pPr>
+              <w:pStyle w:val="Compact"/>
+            </w:pPr>
+            <w:r>
+              <w:t xml:space="preserve">the continuous gate as a free-energy component</w:t>
+            </w:r>
+          </w:p>
+        </w:tc>
+        <w:tc>
+          <w:tcPr/>
+          <w:p>
+            <w:pPr>
+              <w:pStyle w:val="Compact"/>
+            </w:pPr>
+            <w:r>
+              <w:t xml:space="preserve">F = P(lead) × excess; the gate on the probability (the mixture, the measurement model) against the gate on the quantity: indistinguishable (+0.003)</w:t>
+            </w:r>
+          </w:p>
+        </w:tc>
+      </w:tr>
+      <w:tr>
+        <w:tc>
+          <w:tcPr/>
+          <w:p>
+            <w:pPr>
+              <w:pStyle w:val="Compact"/>
+            </w:pPr>
+            <w:r>
+              <w:t xml:space="preserve">JJ.7</w:t>
+            </w:r>
+          </w:p>
+        </w:tc>
+        <w:tc>
+          <w:tcPr/>
+          <w:p>
+            <w:pPr>
+              <w:pStyle w:val="Compact"/>
+            </w:pPr>
+            <w:r>
+              <w:t xml:space="preserve">the boundary as a driver’s prior over looming, gated by predictive uncertainty</w:t>
+            </w:r>
+          </w:p>
+        </w:tc>
+        <w:tc>
+          <w:tcPr/>
+          <w:p>
+            <w:pPr>
+              <w:pStyle w:val="Compact"/>
+            </w:pPr>
+            <w:r>
+              <w:t xml:space="preserve">run 2026-09-22 (background); result in</w:t>
+            </w:r>
+            <w:r>
+              <w:t xml:space="preserve"> </w:t>
+            </w:r>
+            <w:r>
+              <w:rPr>
+                <w:rStyle w:val="VerbatimChar"/>
+              </w:rPr>
+              <w:t xml:space="preserve">out/jj7_driver_prior.md</w:t>
+            </w:r>
+          </w:p>
+        </w:tc>
+      </w:tr>
+      <w:tr>
+        <w:tc>
+          <w:tcPr/>
+          <w:p>
+            <w:pPr>
+              <w:pStyle w:val="Compact"/>
+            </w:pPr>
+            <w:r>
+              <w:t xml:space="preserve">P.1</w:t>
+            </w:r>
+          </w:p>
+        </w:tc>
+        <w:tc>
+          <w:tcPr/>
+          <w:p>
+            <w:pPr>
+              <w:pStyle w:val="Compact"/>
+            </w:pPr>
+            <w:r>
+              <w:t xml:space="preserve">the released planner, corrected</w:t>
+            </w:r>
+          </w:p>
+        </w:tc>
+        <w:tc>
+          <w:tcPr/>
+          <w:p>
+            <w:pPr>
+              <w:pStyle w:val="Compact"/>
+            </w:pPr>
+            <w:r>
+              <w:t xml:space="preserve">run 2026-09-22 (background, hours); result in</w:t>
+            </w:r>
+            <w:r>
+              <w:t xml:space="preserve"> </w:t>
+            </w:r>
+            <w:r>
+              <w:rPr>
+                <w:rStyle w:val="VerbatimChar"/>
+              </w:rPr>
+              <w:t xml:space="preserve">out/p1_planner_corrected.md</w:t>
+            </w:r>
+          </w:p>
+        </w:tc>
+      </w:tr>
+    </w:tbl>
+    <w:p>
+      <w:pPr>
+        <w:pStyle w:val="BodyText"/>
+      </w:pPr>
+      <w:r>
+        <w:rPr>
+          <w:b/>
+          <w:bCs/>
+        </w:rPr>
+        <w:t xml:space="preserve">Where this leaves the program’s six points (opinion).</w:t>
+      </w:r>
+      <w:r>
+        <w:t xml:space="preserve"> </w:t>
+      </w:r>
+      <w:r>
+        <w:t xml:space="preserve">Rollouts of the ego’s policies with</w:t>
+      </w:r>
+      <w:r>
+        <w:t xml:space="preserve"> </w:t>
+      </w:r>
+      <w:r>
+        <w:t xml:space="preserve">least-free-energy choice (point 1) do not measure the comfort-zone boundary on these video studies,</w:t>
+      </w:r>
+      <w:r>
+        <w:t xml:space="preserve"> </w:t>
+      </w:r>
+      <w:r>
+        <w:t xml:space="preserve">for a structural reason: a one-sided preference summed over a planning horizon counts the steps</w:t>
+      </w:r>
+      <w:r>
+        <w:t xml:space="preserve"> </w:t>
+      </w:r>
+      <w:r>
+        <w:t xml:space="preserve">before contact. Uncertainty as the core component (point 3) is exactly what the gate turned out to</w:t>
+      </w:r>
+      <w:r>
+        <w:t xml:space="preserve"> </w:t>
+      </w:r>
+      <w:r>
+        <w:t xml:space="preserve">be: the generative model’s predictive uncertainty about the other’s lateral motion, at the</w:t>
+      </w:r>
+      <w:r>
+        <w:t xml:space="preserve"> </w:t>
+      </w:r>
+      <w:r>
+        <w:t xml:space="preserve">anticipation horizon. The cut-in probability (point 4) as a latent intention is not needed for</w:t>
+      </w:r>
+      <w:r>
+        <w:t xml:space="preserve"> </w:t>
+      </w:r>
+      <w:r>
+        <w:t xml:space="preserve">that gate on this design and, as built, prevented it from grading; its content, the initiation</w:t>
+      </w:r>
+      <w:r>
+        <w:t xml:space="preserve"> </w:t>
+      </w:r>
+      <w:r>
+        <w:t xml:space="preserve">hazard, remains the naturalistic question. The boundary itself is a driver’s prior over the</w:t>
+      </w:r>
+      <w:r>
+        <w:t xml:space="preserve"> </w:t>
+      </w:r>
+      <w:r>
+        <w:t xml:space="preserve">looming of a lead (reading B of the note), which is the measurement model in the framework’s</w:t>
+      </w:r>
+      <w:r>
+        <w:t xml:space="preserve"> </w:t>
+      </w:r>
+      <w:r>
+        <w:t xml:space="preserve">words, with the restatement tested rather than assumed.</w:t>
+      </w:r>
+    </w:p>
+    <w:bookmarkEnd w:id="65"/>
+    <w:bookmarkStart w:id="66" w:name="references"/>
+    <w:p>
+      <w:pPr>
+        <w:pStyle w:val="Heading2"/>
+      </w:pPr>
+      <w:r>
         <w:t xml:space="preserve">References</w:t>
       </w:r>
     </w:p>
@@ -9711,8 +10371,8 @@
         <w:t xml:space="preserve">, 2026).</w:t>
       </w:r>
     </w:p>
-    <w:bookmarkEnd w:id="65"/>
     <w:bookmarkEnd w:id="66"/>
+    <w:bookmarkEnd w:id="67"/>
     <w:sectPr>
       <w:footnotePr>
         <w:numRestart w:val="eachSect"/>

</xml_diff>

<commit_message>
Card JJ.3b run: with a cyclist-sized collision test the lateral factor is retired (0.29 against the clearance rule's 0.15); polygon_only collision mode added behind its name
Co-Authored-By: Claude Fable 5.1 <noreply@anthropic.com>
</commit_message>
<xml_diff>
--- a/docs/active_inference_program.docx
+++ b/docs/active_inference_program.docx
@@ -8873,29 +8873,29 @@
               <w:pStyle w:val="Compact"/>
             </w:pPr>
             <w:r>
-              <w:t xml:space="preserve">JJ.3</w:t>
-            </w:r>
-          </w:p>
-        </w:tc>
-        <w:tc>
-          <w:tcPr/>
-          <w:p>
-            <w:pPr>
-              <w:pStyle w:val="Compact"/>
-            </w:pPr>
-            <w:r>
-              <w:t xml:space="preserve">the same on the left turn and overtake</w:t>
-            </w:r>
-          </w:p>
-        </w:tc>
-        <w:tc>
-          <w:tcPr/>
-          <w:p>
-            <w:pPr>
-              <w:pStyle w:val="Compact"/>
-            </w:pPr>
-            <w:r>
-              <w:t xml:space="preserve">fails; the overtake numbers quoted in the arc were the secondary fold scheme</w:t>
+              <w:t xml:space="preserve">JJ.3, JJ.3b</w:t>
+            </w:r>
+          </w:p>
+        </w:tc>
+        <w:tc>
+          <w:tcPr/>
+          <w:p>
+            <w:pPr>
+              <w:pStyle w:val="Compact"/>
+            </w:pPr>
+            <w:r>
+              <w:t xml:space="preserve">the same on the left turn and overtake; the overtake with a cyclist-sized collision test</w:t>
+            </w:r>
+          </w:p>
+        </w:tc>
+        <w:tc>
+          <w:tcPr/>
+          <w:p>
+            <w:pPr>
+              <w:pStyle w:val="Compact"/>
+            </w:pPr>
+            <w:r>
+              <w:t xml:space="preserve">fails; the overtake numbers quoted in the arc were the secondary fold scheme, and with a cyclist-sized test ΔG scores 0.29 against the clearance rule’s 0.15 (the lateral factor is retired)</w:t>
             </w:r>
           </w:p>
         </w:tc>

</xml_diff>

<commit_message>
Card P.1 closed: DROP over three seeds; the corrected planner brakes and steers in nearly every cell; JJ.13 (F with a memory) added to the plan
Co-Authored-By: Claude Fable 5.1 <noreply@anthropic.com>
</commit_message>
<xml_diff>
--- a/docs/active_inference_program.docx
+++ b/docs/active_inference_program.docx
@@ -9233,16 +9233,14 @@
               <w:pStyle w:val="Compact"/>
             </w:pPr>
             <w:r>
-              <w:t xml:space="preserve">run 2026-09-22 (background); result in</w:t>
-            </w:r>
-            <w:r>
-              <w:t xml:space="preserve"> </w:t>
-            </w:r>
-            <w:r>
               <w:rPr>
-                <w:rStyle w:val="VerbatimChar"/>
+                <w:b/>
+                <w:bCs/>
               </w:rPr>
-              <w:t xml:space="preserve">out/jj7_driver_prior.md</w:t>
+              <w:t xml:space="preserve">RESTATED</w:t>
+            </w:r>
+            <w:r>
+              <w:t xml:space="preserve">: hyperparameters within 0.011 of TR.1’s, per-driver priors +0.999 with TR.1’s levels, the trait +0.640 [+0.395, +0.795]; the population median prior 0.0313 rad/s</w:t>
             </w:r>
           </w:p>
         </w:tc>
@@ -9266,27 +9264,49 @@
               <w:pStyle w:val="Compact"/>
             </w:pPr>
             <w:r>
-              <w:t xml:space="preserve">the released planner, corrected</w:t>
-            </w:r>
-          </w:p>
-        </w:tc>
-        <w:tc>
-          <w:tcPr/>
-          <w:p>
-            <w:pPr>
-              <w:pStyle w:val="Compact"/>
-            </w:pPr>
-            <w:r>
-              <w:t xml:space="preserve">run 2026-09-22 (background, hours); result in</w:t>
+              <w:t xml:space="preserve">the released planner, corrected (ego on the road, coasting pedal state, whole plan examined)</w:t>
+            </w:r>
+          </w:p>
+        </w:tc>
+        <w:tc>
+          <w:tcPr/>
+          <w:p>
+            <w:pPr>
+              <w:pStyle w:val="Compact"/>
+            </w:pPr>
+            <w:r>
+              <w:rPr>
+                <w:b/>
+                <w:bCs/>
+              </w:rPr>
+              <w:t xml:space="preserve">DROP</w:t>
+            </w:r>
+            <w:r>
+              <w:t xml:space="preserve">, stable over three seeds (0.320 to 0.323; 5 to 12 of 24 rows): JJ.2b’s</w:t>
             </w:r>
             <w:r>
               <w:t xml:space="preserve"> </w:t>
             </w:r>
             <w:r>
-              <w:rPr>
-                <w:rStyle w:val="VerbatimChar"/>
-              </w:rPr>
-              <w:t xml:space="preserve">out/p1_planner_corrected.md</w:t>
+              <w:t xml:space="preserve">“19 of 24”</w:t>
+            </w:r>
+            <w:r>
+              <w:t xml:space="preserve"> </w:t>
+            </w:r>
+            <w:r>
+              <w:t xml:space="preserve">was the off-road ego. The corrected planner brakes AND steers from the first step in nearly every cell, pre-onset included (median minimum acceleration −4 to −6 m/s²):</w:t>
+            </w:r>
+            <w:r>
+              <w:t xml:space="preserve"> </w:t>
+            </w:r>
+            <w:r>
+              <w:t xml:space="preserve">“never brakes”</w:t>
+            </w:r>
+            <w:r>
+              <w:t xml:space="preserve"> </w:t>
+            </w:r>
+            <w:r>
+              <w:t xml:space="preserve">was the pedal clamp</w:t>
             </w:r>
           </w:p>
         </w:tc>

</xml_diff>